<commit_message>
Refresh portfolio brand and profile content
</commit_message>
<xml_diff>
--- a/public/Dao_Quang_Truong_CV.docx
+++ b/public/Dao_Quang_Truong_CV.docx
@@ -28,71 +28,23 @@
         <w:rPr/>
       </w:pPr>
       <w:r>
-        <w:rPr>
-          <w:rFonts w:ascii="Times New Roman" w:cs="Times New Roman" w:eastAsia="Times New Roman" w:hAnsi="Times New Roman"/>
-          <w:b w:val="1"/>
-          <w:bCs w:val="1"/>
-          <w:sz w:val="28"/>
-          <w:szCs w:val="28"/>
-          <w:rtl w:val="0"/>
-        </w:rPr>
-        <w:t xml:space="preserve">Fullstack Developer</w:t>
-      </w:r>
-      <w:r>
-        <w:rPr>
-          <w:rtl w:val="0"/>
-        </w:rPr>
-      </w:r>
-    </w:p>
-    <w:p>
-      <w:pPr>
-        <w:rPr/>
-      </w:pPr>
-      <w:r>
-        <w:rPr>
-          <w:rFonts w:ascii="Times New Roman" w:cs="Times New Roman" w:eastAsia="Times New Roman" w:hAnsi="Times New Roman"/>
-          <w:sz w:val="28"/>
-          <w:szCs w:val="28"/>
-          <w:rtl w:val="0"/>
-        </w:rPr>
-        <w:t xml:space="preserve">Ninh Binh, Vietnam | (+84) 96 906 9035 | truongdq.dev@gmail.com</w:t>
-      </w:r>
-      <w:r>
-        <w:rPr>
-          <w:rtl w:val="0"/>
-        </w:rPr>
-      </w:r>
-    </w:p>
-    <w:p>
-      <w:pPr>
-        <w:rPr/>
-      </w:pPr>
-      <w:hyperlink r:id="rId6">
-        <w:r>
-          <w:rPr>
-            <w:rFonts w:ascii="Times New Roman" w:cs="Times New Roman" w:eastAsia="Times New Roman" w:hAnsi="Times New Roman"/>
-            <w:color w:val="1155cc"/>
-            <w:sz w:val="28"/>
-            <w:szCs w:val="28"/>
-            <w:u w:val="single"/>
-            <w:rtl w:val="0"/>
-          </w:rPr>
-          <w:t xml:space="preserve">truongdq.com</w:t>
-        </w:r>
-      </w:hyperlink>
-      <w:r>
-        <w:rPr>
-          <w:rFonts w:ascii="Times New Roman" w:cs="Times New Roman" w:eastAsia="Times New Roman" w:hAnsi="Times New Roman"/>
-          <w:sz w:val="28"/>
-          <w:szCs w:val="28"/>
-          <w:rtl w:val="0"/>
-        </w:rPr>
-        <w:t xml:space="preserve"> |  github.com/truongnat</w:t>
-      </w:r>
-      <w:r>
-        <w:rPr>
-          <w:rtl w:val="0"/>
-        </w:rPr>
+        <w:t>Fullstack Engineer</w:t>
+      </w:r>
+    </w:p>
+    <w:p>
+      <w:pPr>
+        <w:rPr/>
+      </w:pPr>
+      <w:r>
+        <w:t>Hanoi, Vietnam | (+84) 96 906 9035 | truongdq.dev@gmail.com</w:t>
+      </w:r>
+    </w:p>
+    <w:p>
+      <w:pPr>
+        <w:rPr/>
+      </w:pPr>
+      <w:r>
+        <w:t>truongsoftware.com | github.com/truongnat</w:t>
       </w:r>
     </w:p>
     <w:p>
@@ -133,35 +85,7 @@
         <w:rPr/>
       </w:pPr>
       <w:r>
-        <w:rPr>
-          <w:rFonts w:ascii="Times New Roman" w:cs="Times New Roman" w:eastAsia="Times New Roman" w:hAnsi="Times New Roman"/>
-          <w:sz w:val="28"/>
-          <w:szCs w:val="28"/>
-          <w:rtl w:val="0"/>
-        </w:rPr>
-        <w:t xml:space="preserve">Fullstack Developer and Engineering Leader with</w:t>
-      </w:r>
-      <w:r>
-        <w:rPr>
-          <w:sz w:val="28"/>
-          <w:szCs w:val="28"/>
-          <w:rtl w:val="0"/>
-        </w:rPr>
-        <w:t xml:space="preserve"> 4</w:t>
-      </w:r>
-      <w:r>
-        <w:rPr>
-          <w:rFonts w:ascii="Times New Roman" w:cs="Times New Roman" w:eastAsia="Times New Roman" w:hAnsi="Times New Roman"/>
-          <w:sz w:val="28"/>
-          <w:szCs w:val="28"/>
-          <w:rtl w:val="0"/>
-        </w:rPr>
-        <w:t xml:space="preserve"> years of professional experience and a strong focus on the next generation of software engineering via Agentic AI. Proven track record of leading cross-functional teams of 8+ engineers and delivering high-scale enterprise solutions for major clients like Viettel and Naver. Expert in cross-platform applications, and currently pioneering Agentic SDLC frameworks to automate and optimize the software development lifecycle.</w:t>
-      </w:r>
-      <w:r>
-        <w:rPr>
-          <w:rtl w:val="0"/>
-        </w:rPr>
+        <w:t>Fullstack Engineer and Engineering Leader with 6 years of professional experience building cross-platform products and practical AI-assisted developer workflows. Proven track record of leading cross-functional teams of 8+ engineers and delivering high-scale enterprise solutions for major clients like Viettel and Naver. I focus on clean architecture, developer experience, and systems that help teams ship faster without sacrificing maintainability.</w:t>
       </w:r>
     </w:p>
     <w:p>

</xml_diff>

<commit_message>
Polish portfolio credibility and CV
</commit_message>
<xml_diff>
--- a/public/Dao_Quang_Truong_CV.docx
+++ b/public/Dao_Quang_Truong_CV.docx
@@ -85,7 +85,7 @@
         <w:rPr/>
       </w:pPr>
       <w:r>
-        <w:t>Fullstack Engineer and Engineering Leader with 6 years of professional experience building cross-platform products and practical AI-assisted developer workflows. Proven track record of leading cross-functional teams of 8+ engineers and delivering high-scale enterprise solutions for major clients like Viettel and Naver. I focus on clean architecture, developer experience, and systems that help teams ship faster without sacrificing maintainability.</w:t>
+        <w:t>Fullstack Engineer and engineering lead with 6 years of professional experience delivering cross-platform products, modernizing TypeScript systems, and building practical AI-assisted developer workflows. Proven track record leading teams of 8+ engineers, improving backend performance, and shipping production software across web, mobile, desktop, and backend environments.</w:t>
       </w:r>
     </w:p>
     <w:p>
@@ -127,91 +127,25 @@
         <w:rPr/>
       </w:pPr>
       <w:r>
-        <w:rPr>
-          <w:rFonts w:ascii="Times New Roman" w:cs="Times New Roman" w:eastAsia="Times New Roman" w:hAnsi="Times New Roman"/>
-          <w:b w:val="1"/>
-          <w:bCs w:val="1"/>
-          <w:sz w:val="28"/>
-          <w:szCs w:val="28"/>
-          <w:rtl w:val="0"/>
-        </w:rPr>
-        <w:t xml:space="preserve">Lead Developer | AI &amp; Agentic Systems Jan 2024 – Present</w:t>
-      </w:r>
-      <w:r>
-        <w:rPr>
-          <w:rtl w:val="0"/>
-        </w:rPr>
-      </w:r>
-    </w:p>
-    <w:p>
-      <w:pPr>
-        <w:jc w:val="both"/>
-        <w:rPr/>
-      </w:pPr>
-      <w:r>
-        <w:rPr>
-          <w:rFonts w:ascii="Times New Roman" w:cs="Times New Roman" w:eastAsia="Times New Roman" w:hAnsi="Times New Roman"/>
-          <w:b w:val="1"/>
-          <w:bCs w:val="1"/>
-          <w:sz w:val="28"/>
-          <w:szCs w:val="28"/>
-          <w:rtl w:val="0"/>
-        </w:rPr>
-        <w:t xml:space="preserve">• Focus:</w:t>
-      </w:r>
-      <w:r>
-        <w:rPr>
-          <w:rFonts w:ascii="Times New Roman" w:cs="Times New Roman" w:eastAsia="Times New Roman" w:hAnsi="Times New Roman"/>
-          <w:sz w:val="28"/>
-          <w:szCs w:val="28"/>
-          <w:rtl w:val="0"/>
-        </w:rPr>
-        <w:t xml:space="preserve"> Researching and developing autonomous AI agents to revolutionize the Software Development Life Cycle (SDLC).</w:t>
-      </w:r>
-      <w:r>
-        <w:rPr>
-          <w:rtl w:val="0"/>
-        </w:rPr>
-      </w:r>
-    </w:p>
-    <w:p>
-      <w:pPr>
-        <w:jc w:val="both"/>
-        <w:rPr/>
-      </w:pPr>
-      <w:r>
-        <w:rPr>
-          <w:rFonts w:ascii="Times New Roman" w:cs="Times New Roman" w:eastAsia="Times New Roman" w:hAnsi="Times New Roman"/>
-          <w:sz w:val="28"/>
-          <w:szCs w:val="28"/>
-          <w:rtl w:val="0"/>
-        </w:rPr>
-        <w:t xml:space="preserve">•  </w:t>
-      </w:r>
-      <w:r>
-        <w:rPr>
-          <w:rFonts w:ascii="Times New Roman" w:cs="Times New Roman" w:eastAsia="Times New Roman" w:hAnsi="Times New Roman"/>
-          <w:b w:val="1"/>
-          <w:bCs w:val="1"/>
-          <w:sz w:val="28"/>
-          <w:szCs w:val="28"/>
-          <w:rtl w:val="0"/>
-        </w:rPr>
-        <w:t xml:space="preserve">Key Achievement:</w:t>
-      </w:r>
-      <w:r>
-        <w:rPr>
-          <w:rFonts w:ascii="Times New Roman" w:cs="Times New Roman" w:eastAsia="Times New Roman" w:hAnsi="Times New Roman"/>
-          <w:sz w:val="28"/>
-          <w:szCs w:val="28"/>
-          <w:rtl w:val="0"/>
-        </w:rPr>
-        <w:t xml:space="preserve"> Built and open-sourced Agentic-SDLC, a framework that automates coding tasks and system design using Multi-agent orchestration.</w:t>
-      </w:r>
-      <w:r>
-        <w:rPr>
-          <w:rtl w:val="0"/>
-        </w:rPr>
+        <w:t>Independent AI Engineer | Personal R&amp;D and Product Work | Jan 2024 – Present</w:t>
+      </w:r>
+    </w:p>
+    <w:p>
+      <w:pPr>
+        <w:jc w:val="both"/>
+        <w:rPr/>
+      </w:pPr>
+      <w:r>
+        <w:t>• Build and iterate on agentic developer workflows for code generation, repository analysis, and safe execution under practical engineering constraints.</w:t>
+      </w:r>
+    </w:p>
+    <w:p>
+      <w:pPr>
+        <w:jc w:val="both"/>
+        <w:rPr/>
+      </w:pPr>
+      <w:r>
+        <w:t>• Open-source experiments around orchestrated AI agents, local-first tooling, and reusable workflow patterns for product and engineering teams.</w:t>
       </w:r>
     </w:p>
     <w:p>
@@ -286,118 +220,25 @@
         <w:rPr/>
       </w:pPr>
       <w:r>
-        <w:rPr>
-          <w:rFonts w:ascii="Times New Roman" w:cs="Times New Roman" w:eastAsia="Times New Roman" w:hAnsi="Times New Roman"/>
-          <w:sz w:val="28"/>
-          <w:szCs w:val="28"/>
-          <w:rtl w:val="0"/>
-        </w:rPr>
-        <w:t xml:space="preserve">• </w:t>
-      </w:r>
-      <w:r>
-        <w:rPr>
-          <w:rFonts w:ascii="Times New Roman" w:cs="Times New Roman" w:eastAsia="Times New Roman" w:hAnsi="Times New Roman"/>
-          <w:b w:val="1"/>
-          <w:bCs w:val="1"/>
-          <w:sz w:val="28"/>
-          <w:szCs w:val="28"/>
-          <w:rtl w:val="0"/>
-        </w:rPr>
-        <w:t xml:space="preserve">Hiring &amp; Growth:</w:t>
-      </w:r>
-      <w:r>
-        <w:rPr>
-          <w:rFonts w:ascii="Times New Roman" w:cs="Times New Roman" w:eastAsia="Times New Roman" w:hAnsi="Times New Roman"/>
-          <w:sz w:val="28"/>
-          <w:szCs w:val="28"/>
-          <w:rtl w:val="0"/>
-        </w:rPr>
-        <w:t xml:space="preserve"> Scaled the engineering department by designing a rigorous technical interview framework for Frontend and Mobile roles.</w:t>
-      </w:r>
-      <w:r>
-        <w:rPr>
-          <w:rtl w:val="0"/>
-        </w:rPr>
-      </w:r>
-    </w:p>
-    <w:p>
-      <w:pPr>
-        <w:jc w:val="both"/>
-        <w:rPr/>
-      </w:pPr>
-      <w:r>
-        <w:rPr>
-          <w:rFonts w:ascii="Times New Roman" w:cs="Times New Roman" w:eastAsia="Times New Roman" w:hAnsi="Times New Roman"/>
-          <w:sz w:val="28"/>
-          <w:szCs w:val="28"/>
-          <w:rtl w:val="0"/>
-        </w:rPr>
-        <w:t xml:space="preserve">• </w:t>
-      </w:r>
-      <w:r>
-        <w:rPr>
-          <w:rFonts w:ascii="Times New Roman" w:cs="Times New Roman" w:eastAsia="Times New Roman" w:hAnsi="Times New Roman"/>
-          <w:b w:val="1"/>
-          <w:bCs w:val="1"/>
-          <w:sz w:val="28"/>
-          <w:szCs w:val="28"/>
-          <w:rtl w:val="0"/>
-        </w:rPr>
-        <w:t xml:space="preserve">Team Development: </w:t>
-      </w:r>
-      <w:r>
-        <w:rPr>
-          <w:rFonts w:ascii="Times New Roman" w:cs="Times New Roman" w:eastAsia="Times New Roman" w:hAnsi="Times New Roman"/>
-          <w:sz w:val="28"/>
-          <w:szCs w:val="28"/>
-          <w:rtl w:val="0"/>
-        </w:rPr>
-        <w:t xml:space="preserve">Established a structured mentorship program for interns, resulting in improved team-wide code quality and high-performance standards. </w:t>
-      </w:r>
-      <w:r>
-        <w:rPr>
-          <w:rtl w:val="0"/>
-        </w:rPr>
-      </w:r>
-    </w:p>
-    <w:p>
-      <w:pPr>
-        <w:jc w:val="both"/>
-        <w:rPr/>
-      </w:pPr>
-      <w:r>
-        <w:rPr>
-          <w:rFonts w:ascii="Times New Roman" w:cs="Times New Roman" w:eastAsia="Times New Roman" w:hAnsi="Times New Roman"/>
-          <w:sz w:val="28"/>
-          <w:szCs w:val="28"/>
-          <w:rtl w:val="0"/>
-        </w:rPr>
-        <w:t xml:space="preserve">• </w:t>
-      </w:r>
-      <w:r>
-        <w:rPr>
-          <w:rFonts w:ascii="Times New Roman" w:cs="Times New Roman" w:eastAsia="Times New Roman" w:hAnsi="Times New Roman"/>
-          <w:b w:val="1"/>
-          <w:bCs w:val="1"/>
-          <w:sz w:val="28"/>
-          <w:szCs w:val="28"/>
-          <w:rtl w:val="0"/>
-        </w:rPr>
-        <w:t xml:space="preserve">Leadership: </w:t>
-      </w:r>
-      <w:r>
-        <w:rPr>
-          <w:rFonts w:ascii="Times New Roman" w:cs="Times New Roman" w:eastAsia="Times New Roman" w:hAnsi="Times New Roman"/>
-          <w:sz w:val="28"/>
-          <w:szCs w:val="28"/>
-          <w:rtl w:val="0"/>
-        </w:rPr>
-        <w:t xml:space="preserve">Led and mentored a cross-functional team of 8 engineers, aligning technical roadmaps with project milestones.</w:t>
-      </w:r>
-      <w:r>
-        <w:rPr>
-          <w:rtl w:val="0"/>
-        </w:rPr>
+        <w:t>• Hiring &amp; Growth: Designed a practical interview loop for frontend and mobile roles to improve hiring quality and team fit.</w:t>
+      </w:r>
+    </w:p>
+    <w:p>
+      <w:pPr>
+        <w:jc w:val="both"/>
+        <w:rPr/>
+      </w:pPr>
+      <w:r>
+        <w:t>• Team Development: Built a mentorship path for interns and junior engineers that improved code quality and delivery confidence.</w:t>
+      </w:r>
+    </w:p>
+    <w:p>
+      <w:pPr>
+        <w:jc w:val="both"/>
+        <w:rPr/>
+      </w:pPr>
+      <w:r>
+        <w:t>• Leadership: Led and mentored a cross-functional team of 8 engineers while coordinating execution with project milestones.</w:t>
       </w:r>
     </w:p>
     <w:p>
@@ -428,100 +269,25 @@
         <w:rPr/>
       </w:pPr>
       <w:r>
-        <w:rPr>
-          <w:rFonts w:ascii="Times New Roman" w:cs="Times New Roman" w:eastAsia="Times New Roman" w:hAnsi="Times New Roman"/>
-          <w:sz w:val="28"/>
-          <w:szCs w:val="28"/>
-          <w:rtl w:val="0"/>
-        </w:rPr>
-        <w:t xml:space="preserve">• </w:t>
-      </w:r>
-      <w:r>
-        <w:rPr>
-          <w:rFonts w:ascii="Times New Roman" w:cs="Times New Roman" w:eastAsia="Times New Roman" w:hAnsi="Times New Roman"/>
-          <w:b w:val="1"/>
-          <w:bCs w:val="1"/>
-          <w:sz w:val="28"/>
-          <w:szCs w:val="28"/>
-          <w:rtl w:val="0"/>
-        </w:rPr>
-        <w:t xml:space="preserve">System Refactoring</w:t>
-      </w:r>
-      <w:r>
-        <w:rPr>
-          <w:rFonts w:ascii="Times New Roman" w:cs="Times New Roman" w:eastAsia="Times New Roman" w:hAnsi="Times New Roman"/>
-          <w:sz w:val="28"/>
-          <w:szCs w:val="28"/>
-          <w:rtl w:val="0"/>
-        </w:rPr>
-        <w:t xml:space="preserve">:  Refactored legacy Node.js services reducing API latency by 50% and improving system reliability during peak loads.</w:t>
-      </w:r>
-      <w:r>
-        <w:rPr>
-          <w:rtl w:val="0"/>
-        </w:rPr>
-      </w:r>
-    </w:p>
-    <w:p>
-      <w:pPr>
-        <w:jc w:val="both"/>
-        <w:rPr/>
-      </w:pPr>
-      <w:r>
-        <w:rPr>
-          <w:rFonts w:ascii="Times New Roman" w:cs="Times New Roman" w:eastAsia="Times New Roman" w:hAnsi="Times New Roman"/>
-          <w:b w:val="1"/>
-          <w:bCs w:val="1"/>
-          <w:sz w:val="28"/>
-          <w:szCs w:val="28"/>
-          <w:rtl w:val="0"/>
-        </w:rPr>
-        <w:t xml:space="preserve">• Full-stack Development:</w:t>
-      </w:r>
-      <w:r>
-        <w:rPr>
-          <w:rFonts w:ascii="Times New Roman" w:cs="Times New Roman" w:eastAsia="Times New Roman" w:hAnsi="Times New Roman"/>
-          <w:sz w:val="28"/>
-          <w:szCs w:val="28"/>
-          <w:rtl w:val="0"/>
-        </w:rPr>
-        <w:t xml:space="preserve"> Architected a KPI tracking platform and Viettel Cloud features using React, TypeScript, and Node.js.</w:t>
-      </w:r>
-      <w:r>
-        <w:rPr>
-          <w:rtl w:val="0"/>
-        </w:rPr>
-      </w:r>
-    </w:p>
-    <w:p>
-      <w:pPr>
-        <w:jc w:val="both"/>
-        <w:rPr/>
-      </w:pPr>
-      <w:r>
-        <w:rPr>
-          <w:rFonts w:ascii="Times New Roman" w:cs="Times New Roman" w:eastAsia="Times New Roman" w:hAnsi="Times New Roman"/>
-          <w:b w:val="1"/>
-          <w:bCs w:val="1"/>
-          <w:sz w:val="28"/>
-          <w:szCs w:val="28"/>
-          <w:rtl w:val="0"/>
-        </w:rPr>
-        <w:t xml:space="preserve">• Technical Standards:</w:t>
-      </w:r>
-      <w:r>
-        <w:rPr>
-          <w:rFonts w:ascii="Times New Roman" w:cs="Times New Roman" w:eastAsia="Times New Roman" w:hAnsi="Times New Roman"/>
-          <w:sz w:val="28"/>
-          <w:szCs w:val="28"/>
-          <w:rtl w:val="0"/>
-        </w:rPr>
-        <w:t xml:space="preserve"> Established initial project structures and enforced high-level coding standards such as ESLint and Git flow.</w:t>
-      </w:r>
-      <w:r>
-        <w:rPr>
-          <w:rtl w:val="0"/>
-        </w:rPr>
+        <w:t>• System Refactoring: Refactored legacy Node.js services, reducing API latency by 50% and improving reliability during peak traffic.</w:t>
+      </w:r>
+    </w:p>
+    <w:p>
+      <w:pPr>
+        <w:jc w:val="both"/>
+        <w:rPr/>
+      </w:pPr>
+      <w:r>
+        <w:t>• Full-stack Development: Architected KPI tracking and Viettel Cloud features with React, TypeScript, and Node.js.</w:t>
+      </w:r>
+    </w:p>
+    <w:p>
+      <w:pPr>
+        <w:jc w:val="both"/>
+        <w:rPr/>
+      </w:pPr>
+      <w:r>
+        <w:t>• Technical Standards: Standardized project setup, linting, and Git workflows to keep delivery more predictable across the team.</w:t>
       </w:r>
     </w:p>
     <w:p>
@@ -563,118 +329,25 @@
         <w:rPr/>
       </w:pPr>
       <w:r>
-        <w:rPr>
-          <w:rFonts w:ascii="Times New Roman" w:cs="Times New Roman" w:eastAsia="Times New Roman" w:hAnsi="Times New Roman"/>
-          <w:sz w:val="28"/>
-          <w:szCs w:val="28"/>
-          <w:rtl w:val="0"/>
-        </w:rPr>
-        <w:t xml:space="preserve">• </w:t>
-      </w:r>
-      <w:r>
-        <w:rPr>
-          <w:rFonts w:ascii="Times New Roman" w:cs="Times New Roman" w:eastAsia="Times New Roman" w:hAnsi="Times New Roman"/>
-          <w:b w:val="1"/>
-          <w:bCs w:val="1"/>
-          <w:sz w:val="28"/>
-          <w:szCs w:val="28"/>
-          <w:rtl w:val="0"/>
-        </w:rPr>
-        <w:t xml:space="preserve">Cross-Platform Development:</w:t>
-      </w:r>
-      <w:r>
-        <w:rPr>
-          <w:rFonts w:ascii="Times New Roman" w:cs="Times New Roman" w:eastAsia="Times New Roman" w:hAnsi="Times New Roman"/>
-          <w:sz w:val="28"/>
-          <w:szCs w:val="28"/>
-          <w:rtl w:val="0"/>
-        </w:rPr>
-        <w:t xml:space="preserve"> Engineered a unified video conference solution across Web (Vue.js), Desktop (Electron.js), and Mobile (React Native) platforms.</w:t>
-      </w:r>
-      <w:r>
-        <w:rPr>
-          <w:rtl w:val="0"/>
-        </w:rPr>
-      </w:r>
-    </w:p>
-    <w:p>
-      <w:pPr>
-        <w:jc w:val="both"/>
-        <w:rPr/>
-      </w:pPr>
-      <w:r>
-        <w:rPr>
-          <w:rFonts w:ascii="Times New Roman" w:cs="Times New Roman" w:eastAsia="Times New Roman" w:hAnsi="Times New Roman"/>
-          <w:sz w:val="28"/>
-          <w:szCs w:val="28"/>
-          <w:rtl w:val="0"/>
-        </w:rPr>
-        <w:t xml:space="preserve">• </w:t>
-      </w:r>
-      <w:r>
-        <w:rPr>
-          <w:rFonts w:ascii="Times New Roman" w:cs="Times New Roman" w:eastAsia="Times New Roman" w:hAnsi="Times New Roman"/>
-          <w:b w:val="1"/>
-          <w:bCs w:val="1"/>
-          <w:sz w:val="28"/>
-          <w:szCs w:val="28"/>
-          <w:rtl w:val="0"/>
-        </w:rPr>
-        <w:t xml:space="preserve">Real-Time Communication (RTC):</w:t>
-      </w:r>
-      <w:r>
-        <w:rPr>
-          <w:rFonts w:ascii="Times New Roman" w:cs="Times New Roman" w:eastAsia="Times New Roman" w:hAnsi="Times New Roman"/>
-          <w:sz w:val="28"/>
-          <w:szCs w:val="28"/>
-          <w:rtl w:val="0"/>
-        </w:rPr>
-        <w:t xml:space="preserve"> Researched and implemented media synchronization algorithms to stabilize video quality and connection across different devices and bandwidths.</w:t>
-      </w:r>
-      <w:r>
-        <w:rPr>
-          <w:rtl w:val="0"/>
-        </w:rPr>
-      </w:r>
-    </w:p>
-    <w:p>
-      <w:pPr>
-        <w:jc w:val="both"/>
-        <w:rPr/>
-      </w:pPr>
-      <w:r>
-        <w:rPr>
-          <w:rFonts w:ascii="Times New Roman" w:cs="Times New Roman" w:eastAsia="Times New Roman" w:hAnsi="Times New Roman"/>
-          <w:sz w:val="28"/>
-          <w:szCs w:val="28"/>
-          <w:rtl w:val="0"/>
-        </w:rPr>
-        <w:t xml:space="preserve">• </w:t>
-      </w:r>
-      <w:r>
-        <w:rPr>
-          <w:rFonts w:ascii="Times New Roman" w:cs="Times New Roman" w:eastAsia="Times New Roman" w:hAnsi="Times New Roman"/>
-          <w:b w:val="1"/>
-          <w:bCs w:val="1"/>
-          <w:sz w:val="28"/>
-          <w:szCs w:val="28"/>
-          <w:rtl w:val="0"/>
-        </w:rPr>
-        <w:t xml:space="preserve">Code Quality:</w:t>
-      </w:r>
-      <w:r>
-        <w:rPr>
-          <w:rFonts w:ascii="Times New Roman" w:cs="Times New Roman" w:eastAsia="Times New Roman" w:hAnsi="Times New Roman"/>
-          <w:sz w:val="28"/>
-          <w:szCs w:val="28"/>
-          <w:rtl w:val="0"/>
-        </w:rPr>
-        <w:t xml:space="preserve"> Actively participated in code reviews and architectural discussions to ensure clean code and minimize production bugs.</w:t>
-      </w:r>
-      <w:r>
-        <w:rPr>
-          <w:rtl w:val="0"/>
-        </w:rPr>
+        <w:t>• Cross-Platform Development: Engineered a unified video conferencing experience across web (Vue.js), desktop (Electron), and mobile (React Native).</w:t>
+      </w:r>
+    </w:p>
+    <w:p>
+      <w:pPr>
+        <w:jc w:val="both"/>
+        <w:rPr/>
+      </w:pPr>
+      <w:r>
+        <w:t>• Real-Time Communication (RTC): Implemented media synchronization improvements to stabilize video quality across devices and network conditions.</w:t>
+      </w:r>
+    </w:p>
+    <w:p>
+      <w:pPr>
+        <w:jc w:val="both"/>
+        <w:rPr/>
+      </w:pPr>
+      <w:r>
+        <w:t>• Code Quality: Contributed to code reviews and architecture discussions to reduce regressions and improve maintainability.</w:t>
       </w:r>
     </w:p>
     <w:p>
@@ -716,78 +389,16 @@
         <w:rPr/>
       </w:pPr>
       <w:r>
-        <w:rPr>
-          <w:rFonts w:ascii="Times New Roman" w:cs="Times New Roman" w:eastAsia="Times New Roman" w:hAnsi="Times New Roman"/>
-          <w:sz w:val="28"/>
-          <w:szCs w:val="28"/>
-          <w:rtl w:val="0"/>
-        </w:rPr>
-        <w:t xml:space="preserve">• </w:t>
-      </w:r>
-      <w:r>
-        <w:rPr>
-          <w:rFonts w:ascii="Times New Roman" w:cs="Times New Roman" w:eastAsia="Times New Roman" w:hAnsi="Times New Roman"/>
-          <w:b w:val="1"/>
-          <w:bCs w:val="1"/>
-          <w:sz w:val="28"/>
-          <w:szCs w:val="28"/>
-          <w:rtl w:val="0"/>
-        </w:rPr>
-        <w:t xml:space="preserve">Low-Code Platform Development:</w:t>
-      </w:r>
-      <w:r>
-        <w:rPr>
-          <w:rFonts w:ascii="Times New Roman" w:cs="Times New Roman" w:eastAsia="Times New Roman" w:hAnsi="Times New Roman"/>
-          <w:sz w:val="28"/>
-          <w:szCs w:val="28"/>
-          <w:rtl w:val="0"/>
-        </w:rPr>
-        <w:t xml:space="preserve"> Built core features for a mobile app generation platform using React Native, focusing on automation and dynamic functionality.</w:t>
-      </w:r>
-      <w:r>
-        <w:rPr>
-          <w:rtl w:val="0"/>
-        </w:rPr>
-      </w:r>
-    </w:p>
-    <w:p>
-      <w:pPr>
-        <w:jc w:val="both"/>
-        <w:rPr/>
-      </w:pPr>
-      <w:r>
-        <w:rPr>
-          <w:rFonts w:ascii="Times New Roman" w:cs="Times New Roman" w:eastAsia="Times New Roman" w:hAnsi="Times New Roman"/>
-          <w:sz w:val="28"/>
-          <w:szCs w:val="28"/>
-          <w:rtl w:val="0"/>
-        </w:rPr>
-        <w:t xml:space="preserve">• </w:t>
-      </w:r>
-      <w:r>
-        <w:rPr>
-          <w:rFonts w:ascii="Times New Roman" w:cs="Times New Roman" w:eastAsia="Times New Roman" w:hAnsi="Times New Roman"/>
-          <w:b w:val="1"/>
-          <w:bCs w:val="1"/>
-          <w:sz w:val="28"/>
-          <w:szCs w:val="28"/>
-          <w:rtl w:val="0"/>
-        </w:rPr>
-        <w:t xml:space="preserve">E-Learning Application:</w:t>
-      </w:r>
-      <w:r>
-        <w:rPr>
-          <w:rFonts w:ascii="Times New Roman" w:cs="Times New Roman" w:eastAsia="Times New Roman" w:hAnsi="Times New Roman"/>
-          <w:sz w:val="28"/>
-          <w:szCs w:val="28"/>
-          <w:rtl w:val="0"/>
-        </w:rPr>
-        <w:t xml:space="preserve"> Developed an exam and e-learning mobile app with a focus on intuitive user interfaces and smooth interactive flows.</w:t>
-      </w:r>
-      <w:r>
-        <w:rPr>
-          <w:rtl w:val="0"/>
-        </w:rPr>
+        <w:t>• Low-Code Platform Development: Built core React Native features for a low-code mobile generation platform with reusable runtime patterns.</w:t>
+      </w:r>
+    </w:p>
+    <w:p>
+      <w:pPr>
+        <w:jc w:val="both"/>
+        <w:rPr/>
+      </w:pPr>
+      <w:r>
+        <w:t>• E-Learning Application: Delivered exam and e-learning flows with a focus on usability, smooth interaction, and release stability.</w:t>
       </w:r>
     </w:p>
     <w:p>
@@ -875,155 +486,54 @@
         <w:rPr/>
       </w:pPr>
       <w:r>
-        <w:rPr>
-          <w:rFonts w:ascii="Times New Roman" w:cs="Times New Roman" w:eastAsia="Times New Roman" w:hAnsi="Times New Roman"/>
-          <w:b w:val="1"/>
-          <w:bCs w:val="1"/>
-          <w:sz w:val="28"/>
-          <w:szCs w:val="28"/>
-          <w:rtl w:val="0"/>
-        </w:rPr>
-        <w:t xml:space="preserve">•  Challenge: </w:t>
-      </w:r>
-      <w:r>
-        <w:rPr>
-          <w:rFonts w:ascii="Times New Roman" w:cs="Times New Roman" w:eastAsia="Times New Roman" w:hAnsi="Times New Roman"/>
-          <w:sz w:val="28"/>
-          <w:szCs w:val="28"/>
-          <w:rtl w:val="0"/>
-        </w:rPr>
-        <w:t xml:space="preserve">Reducing manual effort in repetitive coding tasks and system documentation.</w:t>
-      </w:r>
-      <w:r>
-        <w:rPr>
-          <w:rtl w:val="0"/>
-        </w:rPr>
-      </w:r>
-    </w:p>
-    <w:p>
-      <w:pPr>
-        <w:jc w:val="both"/>
-        <w:rPr/>
-      </w:pPr>
-      <w:r>
-        <w:rPr>
-          <w:rFonts w:ascii="Times New Roman" w:cs="Times New Roman" w:eastAsia="Times New Roman" w:hAnsi="Times New Roman"/>
-          <w:b w:val="1"/>
-          <w:bCs w:val="1"/>
-          <w:sz w:val="28"/>
-          <w:szCs w:val="28"/>
-          <w:rtl w:val="0"/>
-        </w:rPr>
-        <w:t xml:space="preserve">•  Action: </w:t>
-      </w:r>
-      <w:r>
-        <w:rPr>
-          <w:rFonts w:ascii="Times New Roman" w:cs="Times New Roman" w:eastAsia="Times New Roman" w:hAnsi="Times New Roman"/>
-          <w:sz w:val="28"/>
-          <w:szCs w:val="28"/>
-          <w:rtl w:val="0"/>
-        </w:rPr>
-        <w:t xml:space="preserve">Engineered a Multi-agent system using LangGraph/CrewAI to coordinate AI agents for requirement analysis, code generation, and automated testing.</w:t>
-      </w:r>
-      <w:r>
-        <w:rPr>
-          <w:rtl w:val="0"/>
-        </w:rPr>
-      </w:r>
-    </w:p>
-    <w:p>
-      <w:pPr>
-        <w:jc w:val="both"/>
-        <w:rPr/>
-      </w:pPr>
-      <w:r>
-        <w:rPr>
-          <w:rFonts w:ascii="Times New Roman" w:cs="Times New Roman" w:eastAsia="Times New Roman" w:hAnsi="Times New Roman"/>
-          <w:b w:val="1"/>
-          <w:bCs w:val="1"/>
-          <w:sz w:val="28"/>
-          <w:szCs w:val="28"/>
-          <w:rtl w:val="0"/>
-        </w:rPr>
-        <w:t xml:space="preserve">• Result: </w:t>
-      </w:r>
-      <w:r>
-        <w:rPr>
-          <w:rFonts w:ascii="Times New Roman" w:cs="Times New Roman" w:eastAsia="Times New Roman" w:hAnsi="Times New Roman"/>
-          <w:sz w:val="28"/>
-          <w:szCs w:val="28"/>
-          <w:rtl w:val="0"/>
-        </w:rPr>
-        <w:t xml:space="preserve">Created a functional framework capable of generating production-ready boilerplate and self-correcting code through iterative AI feedback loops.</w:t>
-      </w:r>
-      <w:r>
-        <w:rPr>
-          <w:rtl w:val="0"/>
-        </w:rPr>
-      </w:r>
-    </w:p>
-    <w:p>
-      <w:pPr>
-        <w:jc w:val="both"/>
-        <w:rPr/>
-      </w:pPr>
-      <w:r>
-        <w:rPr>
-          <w:rFonts w:ascii="Times New Roman" w:cs="Times New Roman" w:eastAsia="Times New Roman" w:hAnsi="Times New Roman"/>
-          <w:b w:val="1"/>
-          <w:bCs w:val="1"/>
-          <w:sz w:val="28"/>
-          <w:szCs w:val="28"/>
-          <w:rtl w:val="0"/>
-        </w:rPr>
-        <w:t xml:space="preserve">• Tech Stack: </w:t>
-      </w:r>
-      <w:r>
-        <w:rPr>
-          <w:rFonts w:ascii="Times New Roman" w:cs="Times New Roman" w:eastAsia="Times New Roman" w:hAnsi="Times New Roman"/>
-          <w:sz w:val="28"/>
-          <w:szCs w:val="28"/>
-          <w:rtl w:val="0"/>
-        </w:rPr>
-        <w:t xml:space="preserve">Antigravity, Gemini, Neo4j, LEANN</w:t>
-      </w:r>
-      <w:r>
-        <w:rPr>
-          <w:rtl w:val="0"/>
-        </w:rPr>
-      </w:r>
-    </w:p>
-    <w:p>
-      <w:pPr>
-        <w:jc w:val="both"/>
-        <w:rPr/>
-      </w:pPr>
-      <w:r>
-        <w:rPr>
-          <w:rtl w:val="0"/>
-        </w:rPr>
-      </w:r>
-    </w:p>
-    <w:p>
-      <w:pPr>
-        <w:jc w:val="both"/>
-        <w:rPr/>
-      </w:pPr>
-      <w:r>
-        <w:rPr>
-          <w:rFonts w:ascii="Times New Roman" w:cs="Times New Roman" w:eastAsia="Times New Roman" w:hAnsi="Times New Roman"/>
-          <w:b w:val="1"/>
-          <w:bCs w:val="1"/>
-          <w:sz w:val="28"/>
-          <w:szCs w:val="28"/>
-          <w:rtl w:val="0"/>
-        </w:rPr>
-        <w:t xml:space="preserve">Tech Stack: Python, LangChain, LLMs, Docker, GitHub Actions.</w:t>
-      </w:r>
-      <w:r>
-        <w:rPr>
-          <w:rtl w:val="0"/>
-        </w:rPr>
+        <w:t>• Challenge: Reduce manual engineering effort across repetitive coding tasks, documentation, and project setup.</w:t>
+      </w:r>
+    </w:p>
+    <w:p>
+      <w:pPr>
+        <w:jc w:val="both"/>
+        <w:rPr/>
+      </w:pPr>
+      <w:r>
+        <w:t>• Action: Designed multi-agent workflows for requirement analysis, code generation, and automated verification using LLM tooling and graph-backed context.</w:t>
+      </w:r>
+    </w:p>
+    <w:p>
+      <w:pPr>
+        <w:jc w:val="both"/>
+        <w:rPr/>
+      </w:pPr>
+      <w:r>
+        <w:t>• Result: Produced reusable internal workflows and open-source experiments that improved iteration speed and made AI execution more repeatable.</w:t>
+      </w:r>
+    </w:p>
+    <w:p>
+      <w:pPr>
+        <w:jc w:val="both"/>
+        <w:rPr/>
+      </w:pPr>
+      <w:r>
+        <w:t>• Tech Stack: Antigravity, Gemini, Neo4j, LEANN.</w:t>
+      </w:r>
+    </w:p>
+    <w:p>
+      <w:pPr>
+        <w:jc w:val="both"/>
+        <w:rPr/>
+      </w:pPr>
+      <w:r>
+        <w:rPr>
+          <w:rtl w:val="0"/>
+        </w:rPr>
+      </w:r>
+    </w:p>
+    <w:p>
+      <w:pPr>
+        <w:jc w:val="both"/>
+        <w:rPr/>
+      </w:pPr>
+      <w:r>
+        <w:t>• Core Stack: Python, LangChain, LLMs, Docker, GitHub Actions.</w:t>
       </w:r>
     </w:p>
     <w:p>
@@ -1107,78 +617,16 @@
         <w:rPr/>
       </w:pPr>
       <w:r>
-        <w:rPr>
-          <w:rFonts w:ascii="Times New Roman" w:cs="Times New Roman" w:eastAsia="Times New Roman" w:hAnsi="Times New Roman"/>
-          <w:sz w:val="28"/>
-          <w:szCs w:val="28"/>
-          <w:rtl w:val="0"/>
-        </w:rPr>
-        <w:t xml:space="preserve">• </w:t>
-      </w:r>
-      <w:r>
-        <w:rPr>
-          <w:rFonts w:ascii="Times New Roman" w:cs="Times New Roman" w:eastAsia="Times New Roman" w:hAnsi="Times New Roman"/>
-          <w:b w:val="1"/>
-          <w:bCs w:val="1"/>
-          <w:sz w:val="28"/>
-          <w:szCs w:val="28"/>
-          <w:rtl w:val="0"/>
-        </w:rPr>
-        <w:t xml:space="preserve">Action:</w:t>
-      </w:r>
-      <w:r>
-        <w:rPr>
-          <w:rFonts w:ascii="Times New Roman" w:cs="Times New Roman" w:eastAsia="Times New Roman" w:hAnsi="Times New Roman"/>
-          <w:sz w:val="28"/>
-          <w:szCs w:val="28"/>
-          <w:rtl w:val="0"/>
-        </w:rPr>
-        <w:t xml:space="preserve"> Led frontend development, building the foundational React and React Native codebases. Designed and implemented an interactive geospatial data visualization feature (Vietnam Map) for mobile. Established the full CI/CD pipeline using GitLab CI/CD, Jenkins, and Linux VPS (Nginx).</w:t>
-      </w:r>
-      <w:r>
-        <w:rPr>
-          <w:rtl w:val="0"/>
-        </w:rPr>
-      </w:r>
-    </w:p>
-    <w:p>
-      <w:pPr>
-        <w:jc w:val="both"/>
-        <w:rPr/>
-      </w:pPr>
-      <w:r>
-        <w:rPr>
-          <w:rFonts w:ascii="Times New Roman" w:cs="Times New Roman" w:eastAsia="Times New Roman" w:hAnsi="Times New Roman"/>
-          <w:sz w:val="28"/>
-          <w:szCs w:val="28"/>
-          <w:rtl w:val="0"/>
-        </w:rPr>
-        <w:t xml:space="preserve">• </w:t>
-      </w:r>
-      <w:r>
-        <w:rPr>
-          <w:rFonts w:ascii="Times New Roman" w:cs="Times New Roman" w:eastAsia="Times New Roman" w:hAnsi="Times New Roman"/>
-          <w:b w:val="1"/>
-          <w:bCs w:val="1"/>
-          <w:sz w:val="28"/>
-          <w:szCs w:val="28"/>
-          <w:rtl w:val="0"/>
-        </w:rPr>
-        <w:t xml:space="preserve">Result:</w:t>
-      </w:r>
-      <w:r>
-        <w:rPr>
-          <w:rFonts w:ascii="Times New Roman" w:cs="Times New Roman" w:eastAsia="Times New Roman" w:hAnsi="Times New Roman"/>
-          <w:sz w:val="28"/>
-          <w:szCs w:val="28"/>
-          <w:rtl w:val="0"/>
-        </w:rPr>
-        <w:t xml:space="preserve"> Enabled real-time regional KPI tracking on mobile devices. Automated the build and deployment process for iOS and Android, significantly reducing manual release time. Acted as a technical mentor for junior team members.</w:t>
-      </w:r>
-      <w:r>
-        <w:rPr>
-          <w:rtl w:val="0"/>
-        </w:rPr>
+        <w:t>• Action: Led frontend delivery across React and React Native, built regional KPI map visualizations, and set up CI/CD with GitLab CI, Jenkins, and Nginx-based deployment.</w:t>
+      </w:r>
+    </w:p>
+    <w:p>
+      <w:pPr>
+        <w:jc w:val="both"/>
+        <w:rPr/>
+      </w:pPr>
+      <w:r>
+        <w:t>• Result: Enabled real-time regional KPI tracking on mobile and reduced manual release work for both iOS and Android delivery.</w:t>
       </w:r>
     </w:p>
     <w:p>
@@ -1313,78 +761,16 @@
         <w:rPr/>
       </w:pPr>
       <w:r>
-        <w:rPr>
-          <w:rFonts w:ascii="Times New Roman" w:cs="Times New Roman" w:eastAsia="Times New Roman" w:hAnsi="Times New Roman"/>
-          <w:sz w:val="28"/>
-          <w:szCs w:val="28"/>
-          <w:rtl w:val="0"/>
-        </w:rPr>
-        <w:t xml:space="preserve">• </w:t>
-      </w:r>
-      <w:r>
-        <w:rPr>
-          <w:rFonts w:ascii="Times New Roman" w:cs="Times New Roman" w:eastAsia="Times New Roman" w:hAnsi="Times New Roman"/>
-          <w:b w:val="1"/>
-          <w:bCs w:val="1"/>
-          <w:sz w:val="28"/>
-          <w:szCs w:val="28"/>
-          <w:rtl w:val="0"/>
-        </w:rPr>
-        <w:t xml:space="preserve">Action:</w:t>
-      </w:r>
-      <w:r>
-        <w:rPr>
-          <w:rFonts w:ascii="Times New Roman" w:cs="Times New Roman" w:eastAsia="Times New Roman" w:hAnsi="Times New Roman"/>
-          <w:sz w:val="28"/>
-          <w:szCs w:val="28"/>
-          <w:rtl w:val="0"/>
-        </w:rPr>
-        <w:t xml:space="preserve"> Engineered real-time video features for web (Vue.js), desktop (Electron), and mobile (React Native) using the Jitsi Meet core. Conducted R&amp;D to implement custom media resolution adaptation algorithms. Built a native notification system for the Electron desktop app to overcome web API limitations.</w:t>
-      </w:r>
-      <w:r>
-        <w:rPr>
-          <w:rtl w:val="0"/>
-        </w:rPr>
-      </w:r>
-    </w:p>
-    <w:p>
-      <w:pPr>
-        <w:jc w:val="both"/>
-        <w:rPr/>
-      </w:pPr>
-      <w:r>
-        <w:rPr>
-          <w:rFonts w:ascii="Times New Roman" w:cs="Times New Roman" w:eastAsia="Times New Roman" w:hAnsi="Times New Roman"/>
-          <w:sz w:val="28"/>
-          <w:szCs w:val="28"/>
-          <w:rtl w:val="0"/>
-        </w:rPr>
-        <w:t xml:space="preserve">• </w:t>
-      </w:r>
-      <w:r>
-        <w:rPr>
-          <w:rFonts w:ascii="Times New Roman" w:cs="Times New Roman" w:eastAsia="Times New Roman" w:hAnsi="Times New Roman"/>
-          <w:b w:val="1"/>
-          <w:bCs w:val="1"/>
-          <w:sz w:val="28"/>
-          <w:szCs w:val="28"/>
-          <w:rtl w:val="0"/>
-        </w:rPr>
-        <w:t xml:space="preserve">Result:</w:t>
-      </w:r>
-      <w:r>
-        <w:rPr>
-          <w:rFonts w:ascii="Times New Roman" w:cs="Times New Roman" w:eastAsia="Times New Roman" w:hAnsi="Times New Roman"/>
-          <w:sz w:val="28"/>
-          <w:szCs w:val="28"/>
-          <w:rtl w:val="0"/>
-        </w:rPr>
-        <w:t xml:space="preserve"> Delivered a seamless cross-platform conferencing tool that maintained stable video quality. Improved user engagement with a reliable desktop notification system.</w:t>
-      </w:r>
-      <w:r>
-        <w:rPr>
-          <w:rtl w:val="0"/>
-        </w:rPr>
+        <w:t>• Action: Built real-time collaboration features across web, desktop, and mobile, including media adaptation work and desktop notification support.</w:t>
+      </w:r>
+    </w:p>
+    <w:p>
+      <w:pPr>
+        <w:jc w:val="both"/>
+        <w:rPr/>
+      </w:pPr>
+      <w:r>
+        <w:t>• Result: Delivered a stable conferencing experience with better cross-platform consistency and stronger user engagement on desktop.</w:t>
       </w:r>
     </w:p>
     <w:p>
@@ -1519,6 +905,24 @@
         <w:rPr/>
       </w:pPr>
       <w:r>
+        <w:t>• Action: Built the React Native app and implemented an offline-first data flow with Realm DB for local caching and sync.</w:t>
+      </w:r>
+    </w:p>
+    <w:p>
+      <w:pPr>
+        <w:jc w:val="both"/>
+        <w:rPr/>
+      </w:pPr>
+      <w:r>
+        <w:t>• Result: Shipped a stable exam experience that continued to work reliably even with intermittent connectivity.</w:t>
+      </w:r>
+    </w:p>
+    <w:p>
+      <w:pPr>
+        <w:jc w:val="both"/>
+        <w:rPr/>
+      </w:pPr>
+      <w:r>
         <w:rPr>
           <w:rFonts w:ascii="Times New Roman" w:cs="Times New Roman" w:eastAsia="Times New Roman" w:hAnsi="Times New Roman"/>
           <w:sz w:val="28"/>
@@ -1537,88 +941,6 @@
           <w:szCs w:val="28"/>
           <w:rtl w:val="0"/>
         </w:rPr>
-        <w:t xml:space="preserve">Action:</w:t>
-      </w:r>
-      <w:r>
-        <w:rPr>
-          <w:rFonts w:ascii="Times New Roman" w:cs="Times New Roman" w:eastAsia="Times New Roman" w:hAnsi="Times New Roman"/>
-          <w:sz w:val="28"/>
-          <w:szCs w:val="28"/>
-          <w:rtl w:val="0"/>
-        </w:rPr>
-        <w:t xml:space="preserve"> Developed the mobile app using React Native and implemented an offline-first architecture using Realm DB for local data caching and synchronization.</w:t>
-      </w:r>
-      <w:r>
-        <w:rPr>
-          <w:rtl w:val="0"/>
-        </w:rPr>
-      </w:r>
-    </w:p>
-    <w:p>
-      <w:pPr>
-        <w:jc w:val="both"/>
-        <w:rPr/>
-      </w:pPr>
-      <w:r>
-        <w:rPr>
-          <w:rFonts w:ascii="Times New Roman" w:cs="Times New Roman" w:eastAsia="Times New Roman" w:hAnsi="Times New Roman"/>
-          <w:sz w:val="28"/>
-          <w:szCs w:val="28"/>
-          <w:rtl w:val="0"/>
-        </w:rPr>
-        <w:tab/>
-        <w:t xml:space="preserve">• </w:t>
-      </w:r>
-      <w:r>
-        <w:rPr>
-          <w:rFonts w:ascii="Times New Roman" w:cs="Times New Roman" w:eastAsia="Times New Roman" w:hAnsi="Times New Roman"/>
-          <w:b w:val="1"/>
-          <w:bCs w:val="1"/>
-          <w:sz w:val="28"/>
-          <w:szCs w:val="28"/>
-          <w:rtl w:val="0"/>
-        </w:rPr>
-        <w:t xml:space="preserve">Result:</w:t>
-      </w:r>
-      <w:r>
-        <w:rPr>
-          <w:rFonts w:ascii="Times New Roman" w:cs="Times New Roman" w:eastAsia="Times New Roman" w:hAnsi="Times New Roman"/>
-          <w:sz w:val="28"/>
-          <w:szCs w:val="28"/>
-          <w:rtl w:val="0"/>
-        </w:rPr>
-        <w:t xml:space="preserve"> Successfully launched the app, which handled complex exam flows smoothly. The offline capability ensured uninterrupted user experience, directly addressing client requirements.</w:t>
-      </w:r>
-      <w:r>
-        <w:rPr>
-          <w:rtl w:val="0"/>
-        </w:rPr>
-      </w:r>
-    </w:p>
-    <w:p>
-      <w:pPr>
-        <w:jc w:val="both"/>
-        <w:rPr/>
-      </w:pPr>
-      <w:r>
-        <w:rPr>
-          <w:rFonts w:ascii="Times New Roman" w:cs="Times New Roman" w:eastAsia="Times New Roman" w:hAnsi="Times New Roman"/>
-          <w:sz w:val="28"/>
-          <w:szCs w:val="28"/>
-          <w:rtl w:val="0"/>
-        </w:rPr>
-        <w:tab/>
-        <w:t xml:space="preserve">• </w:t>
-      </w:r>
-      <w:r>
-        <w:rPr>
-          <w:rFonts w:ascii="Times New Roman" w:cs="Times New Roman" w:eastAsia="Times New Roman" w:hAnsi="Times New Roman"/>
-          <w:b w:val="1"/>
-          <w:bCs w:val="1"/>
-          <w:sz w:val="28"/>
-          <w:szCs w:val="28"/>
-          <w:rtl w:val="0"/>
-        </w:rPr>
         <w:t xml:space="preserve">Tech Stack:</w:t>
       </w:r>
       <w:r>
@@ -1782,158 +1104,34 @@
         <w:rPr/>
       </w:pPr>
       <w:r>
-        <w:rPr>
-          <w:rFonts w:ascii="Times New Roman" w:cs="Times New Roman" w:eastAsia="Times New Roman" w:hAnsi="Times New Roman"/>
-          <w:sz w:val="28"/>
-          <w:szCs w:val="28"/>
-          <w:rtl w:val="0"/>
-        </w:rPr>
-        <w:t xml:space="preserve">• </w:t>
-      </w:r>
-      <w:r>
-        <w:rPr>
-          <w:rFonts w:ascii="Times New Roman" w:cs="Times New Roman" w:eastAsia="Times New Roman" w:hAnsi="Times New Roman"/>
-          <w:b w:val="1"/>
-          <w:bCs w:val="1"/>
-          <w:sz w:val="28"/>
-          <w:szCs w:val="28"/>
-          <w:rtl w:val="0"/>
-        </w:rPr>
-        <w:t xml:space="preserve">Engineering Leadership: </w:t>
-      </w:r>
-      <w:r>
-        <w:rPr>
-          <w:rFonts w:ascii="Times New Roman" w:cs="Times New Roman" w:eastAsia="Times New Roman" w:hAnsi="Times New Roman"/>
-          <w:sz w:val="28"/>
-          <w:szCs w:val="28"/>
-          <w:rtl w:val="0"/>
-        </w:rPr>
-        <w:t xml:space="preserve">System Architecture, Team Mentoring, Technical Interviewing, Agile/Scrum, CI/CD Pipeline Design.</w:t>
-      </w:r>
-      <w:r>
-        <w:rPr>
-          <w:rtl w:val="0"/>
-        </w:rPr>
-      </w:r>
-    </w:p>
-    <w:p>
-      <w:pPr>
-        <w:jc w:val="both"/>
-        <w:rPr/>
-      </w:pPr>
-      <w:r>
-        <w:rPr>
-          <w:rFonts w:ascii="Times New Roman" w:cs="Times New Roman" w:eastAsia="Times New Roman" w:hAnsi="Times New Roman"/>
-          <w:sz w:val="28"/>
-          <w:szCs w:val="28"/>
-          <w:rtl w:val="0"/>
-        </w:rPr>
-        <w:t xml:space="preserve">• </w:t>
-      </w:r>
-      <w:r>
-        <w:rPr>
-          <w:rFonts w:ascii="Times New Roman" w:cs="Times New Roman" w:eastAsia="Times New Roman" w:hAnsi="Times New Roman"/>
-          <w:b w:val="1"/>
-          <w:bCs w:val="1"/>
-          <w:sz w:val="28"/>
-          <w:szCs w:val="28"/>
-          <w:rtl w:val="0"/>
-        </w:rPr>
-        <w:t xml:space="preserve">AI &amp; Automation:</w:t>
-      </w:r>
-      <w:r>
-        <w:rPr>
-          <w:rFonts w:ascii="Times New Roman" w:cs="Times New Roman" w:eastAsia="Times New Roman" w:hAnsi="Times New Roman"/>
-          <w:sz w:val="28"/>
-          <w:szCs w:val="28"/>
-          <w:rtl w:val="0"/>
-        </w:rPr>
-        <w:t xml:space="preserve"> Agentic SDLC, LLM, Multi-agent Systems, Prompt Engineering, AI-Powered Development (Cursor, Copilot).</w:t>
-      </w:r>
-      <w:r>
-        <w:rPr>
-          <w:rtl w:val="0"/>
-        </w:rPr>
-      </w:r>
-    </w:p>
-    <w:p>
-      <w:pPr>
-        <w:jc w:val="both"/>
-        <w:rPr/>
-      </w:pPr>
-      <w:r>
-        <w:rPr>
-          <w:rFonts w:ascii="Times New Roman" w:cs="Times New Roman" w:eastAsia="Times New Roman" w:hAnsi="Times New Roman"/>
-          <w:sz w:val="28"/>
-          <w:szCs w:val="28"/>
-          <w:rtl w:val="0"/>
-        </w:rPr>
-        <w:t xml:space="preserve">•  </w:t>
-      </w:r>
-      <w:r>
-        <w:rPr>
-          <w:rFonts w:ascii="Times New Roman" w:cs="Times New Roman" w:eastAsia="Times New Roman" w:hAnsi="Times New Roman"/>
-          <w:b w:val="1"/>
-          <w:bCs w:val="1"/>
-          <w:sz w:val="28"/>
-          <w:szCs w:val="28"/>
-          <w:rtl w:val="0"/>
-        </w:rPr>
-        <w:t xml:space="preserve">Fullstack Development: </w:t>
-      </w:r>
-      <w:r>
-        <w:rPr>
-          <w:rFonts w:ascii="Times New Roman" w:cs="Times New Roman" w:eastAsia="Times New Roman" w:hAnsi="Times New Roman"/>
-          <w:sz w:val="28"/>
-          <w:szCs w:val="28"/>
-          <w:rtl w:val="0"/>
-        </w:rPr>
-        <w:t xml:space="preserve">TypeScript, Next.js, Node.js (NestJS/Express), React Native, Electron.js, Vue.js.</w:t>
-      </w:r>
-      <w:r>
-        <w:rPr>
-          <w:rtl w:val="0"/>
-        </w:rPr>
-      </w:r>
-    </w:p>
-    <w:p>
-      <w:pPr>
-        <w:jc w:val="both"/>
-        <w:rPr/>
-      </w:pPr>
-      <w:r>
-        <w:rPr>
-          <w:rFonts w:ascii="Times New Roman" w:cs="Times New Roman" w:eastAsia="Times New Roman" w:hAnsi="Times New Roman"/>
-          <w:sz w:val="28"/>
-          <w:szCs w:val="28"/>
-          <w:rtl w:val="0"/>
-        </w:rPr>
-        <w:t xml:space="preserve">• </w:t>
-      </w:r>
-      <w:r>
-        <w:rPr>
-          <w:rFonts w:ascii="Times New Roman" w:cs="Times New Roman" w:eastAsia="Times New Roman" w:hAnsi="Times New Roman"/>
-          <w:b w:val="1"/>
-          <w:bCs w:val="1"/>
-          <w:sz w:val="28"/>
-          <w:szCs w:val="28"/>
-          <w:rtl w:val="0"/>
-        </w:rPr>
-        <w:t xml:space="preserve"> Infrastructure &amp; DevOps:</w:t>
-      </w:r>
-      <w:r>
-        <w:rPr>
-          <w:rFonts w:ascii="Times New Roman" w:cs="Times New Roman" w:eastAsia="Times New Roman" w:hAnsi="Times New Roman"/>
-          <w:sz w:val="28"/>
-          <w:szCs w:val="28"/>
-          <w:rtl w:val="0"/>
-        </w:rPr>
-        <w:t xml:space="preserve"> Docker, Jenkins, GitLab CI/CD, Nginx, AWS, Linux/Ubuntu.</w:t>
-      </w:r>
-      <w:r>
-        <w:rPr>
-          <w:rtl w:val="0"/>
-        </w:rPr>
+        <w:t>• Engineering Leadership: System Architecture, Team Mentoring, Technical Interviewing, Agile/Scrum, CI/CD Design.</w:t>
+      </w:r>
+    </w:p>
+    <w:p>
+      <w:pPr>
+        <w:jc w:val="both"/>
+        <w:rPr/>
+      </w:pPr>
+      <w:r>
+        <w:t>• AI &amp; Automation: Agentic Workflows, LLM Integration, Multi-agent Systems, Prompt Engineering, AI-Assisted Development.</w:t>
+      </w:r>
+    </w:p>
+    <w:p>
+      <w:pPr>
+        <w:jc w:val="both"/>
+        <w:rPr/>
+      </w:pPr>
+      <w:r>
+        <w:t>• Fullstack Development: TypeScript, Next.js, Node.js (NestJS/Express), React Native, Electron.js, Vue.js.</w:t>
+      </w:r>
+    </w:p>
+    <w:p>
+      <w:pPr>
+        <w:jc w:val="both"/>
+        <w:rPr/>
+      </w:pPr>
+      <w:r>
+        <w:t>• Infrastructure &amp; DevOps: Docker, Jenkins, GitLab CI/CD, Nginx, AWS, Linux/Ubuntu.</w:t>
       </w:r>
     </w:p>
     <w:sectPr>

</xml_diff>